<commit_message>
docs(roteiro): instrucoes de conexao SSH com placeholders genericos
Adiciona a secao 'Como comecar' com passo-a-passo de conexao
(salvar a chave, chmod, ssh, validar fingerprint), usando placeholders
(<usuario>, <endereco-do-servidor>, <fingerprint>, <chave>) em vez de
dados especificos da infra. Operador envia esses dados por mensagem
junto da chave.
</commit_message>
<xml_diff>
--- a/docs/usability-study/ROTEIRO_PARTICIPANTE.docx
+++ b/docs/usability-study/ROTEIRO_PARTICIPANTE.docx
@@ -2,7 +2,7 @@
 <file path=word/document.xml><?xml version="1.0" encoding="utf-8"?>
 <w:document xmlns:w="http://schemas.openxmlformats.org/wordprocessingml/2006/main" xmlns:m="http://schemas.openxmlformats.org/officeDocument/2006/math" xmlns:r="http://schemas.openxmlformats.org/officeDocument/2006/relationships" xmlns:o="urn:schemas-microsoft-com:office:office" xmlns:v="urn:schemas-microsoft-com:vml" xmlns:w10="urn:schemas-microsoft-com:office:word" xmlns:a="http://schemas.openxmlformats.org/drawingml/2006/main" xmlns:pic="http://schemas.openxmlformats.org/drawingml/2006/picture" xmlns:wp="http://schemas.openxmlformats.org/drawingml/2006/wordprocessingDrawing">
   <w:body>
-    <w:bookmarkStart w:id="32" w:name="roteiro-adminforge-sessão-de-uso"/>
+    <w:bookmarkStart w:id="35" w:name="roteiro-adminforge-sessão-de-uso"/>
     <w:p>
       <w:pPr>
         <w:pStyle w:val="Heading1"/>
@@ -134,7 +134,7 @@
         </w:pict>
       </w:r>
     </w:p>
-    <w:bookmarkStart w:id="20" w:name="como-começar"/>
+    <w:bookmarkStart w:id="23" w:name="como-começar"/>
     <w:p>
       <w:pPr>
         <w:pStyle w:val="Heading2"/>
@@ -148,221 +148,20 @@
         <w:pStyle w:val="FirstParagraph"/>
       </w:pPr>
       <w:r>
-        <w:t xml:space="preserve">O facilitador vai te dizer como</w:t>
-      </w:r>
-      <w:r>
-        <w:t xml:space="preserve"> </w:t>
-      </w:r>
-      <w:r>
-        <w:rPr>
-          <w:bCs/>
-          <w:b/>
-        </w:rPr>
-        <w:t xml:space="preserve">entrar</w:t>
-      </w:r>
-      <w:r>
-        <w:t xml:space="preserve"> </w:t>
-      </w:r>
-      <w:r>
-        <w:t xml:space="preserve">no ambiente (um</w:t>
-      </w:r>
-      <w:r>
-        <w:t xml:space="preserve"> </w:t>
-      </w:r>
-      <w:r>
-        <w:rPr>
-          <w:rStyle w:val="VerbatimChar"/>
-        </w:rPr>
-        <w:t xml:space="preserve">ssh ...</w:t>
-      </w:r>
-      <w:r>
-        <w:t xml:space="preserve"> </w:t>
-      </w:r>
-      <w:r>
-        <w:t xml:space="preserve">ou comando equivalente que cai</w:t>
-      </w:r>
-      <w:r>
-        <w:t xml:space="preserve"> </w:t>
-      </w:r>
-      <w:r>
-        <w:t xml:space="preserve">num terminal já com a ferramenta</w:t>
-      </w:r>
-      <w:r>
-        <w:t xml:space="preserve"> </w:t>
-      </w:r>
-      <w:r>
-        <w:rPr>
-          <w:rStyle w:val="VerbatimChar"/>
-        </w:rPr>
-        <w:t xml:space="preserve">adminforge</w:t>
-      </w:r>
-      <w:r>
-        <w:t xml:space="preserve"> </w:t>
-      </w:r>
-      <w:r>
-        <w:t xml:space="preserve">disponível — tem</w:t>
-      </w:r>
-      <w:r>
-        <w:t xml:space="preserve"> </w:t>
-      </w:r>
-      <w:r>
-        <w:rPr>
-          <w:bCs/>
-          <w:b/>
-        </w:rPr>
-        <w:t xml:space="preserve">autocomplete</w:t>
-      </w:r>
-      <w:r>
-        <w:t xml:space="preserve"> </w:t>
-      </w:r>
-      <w:r>
-        <w:t xml:space="preserve">com</w:t>
-      </w:r>
-      <w:r>
-        <w:t xml:space="preserve"> </w:t>
-      </w:r>
-      <w:r>
-        <w:rPr>
-          <w:rStyle w:val="VerbatimChar"/>
-        </w:rPr>
-        <w:t xml:space="preserve">Tab</w:t>
-      </w:r>
-      <w:r>
-        <w:t xml:space="preserve">, e</w:t>
-      </w:r>
-      <w:r>
-        <w:t xml:space="preserve"> </w:t>
-      </w:r>
-      <w:r>
-        <w:rPr>
-          <w:rStyle w:val="VerbatimChar"/>
-        </w:rPr>
-        <w:t xml:space="preserve">af</w:t>
-      </w:r>
-      <w:r>
-        <w:t xml:space="preserve"> </w:t>
-      </w:r>
-      <w:r>
-        <w:t xml:space="preserve">funciona como atalho de</w:t>
-      </w:r>
-      <w:r>
-        <w:t xml:space="preserve"> </w:t>
-      </w:r>
-      <w:r>
-        <w:rPr>
-          <w:rStyle w:val="VerbatimChar"/>
-        </w:rPr>
-        <w:t xml:space="preserve">adminforge</w:t>
-      </w:r>
-      <w:r>
-        <w:t xml:space="preserve">).</w:t>
-      </w:r>
-    </w:p>
-    <w:p>
-      <w:pPr>
-        <w:pStyle w:val="BodyText"/>
-      </w:pPr>
-      <w:r>
-        <w:t xml:space="preserve">A</w:t>
-      </w:r>
-      <w:r>
-        <w:t xml:space="preserve"> </w:t>
-      </w:r>
-      <w:r>
-        <w:rPr>
-          <w:bCs/>
-          <w:b/>
-        </w:rPr>
-        <w:t xml:space="preserve">chave pública da Alice</w:t>
-      </w:r>
-      <w:r>
-        <w:t xml:space="preserve"> </w:t>
-      </w:r>
-      <w:r>
-        <w:t xml:space="preserve">(Tarefa 1) está num arquivo</w:t>
-      </w:r>
-      <w:r>
-        <w:t xml:space="preserve"> </w:t>
-      </w:r>
-      <w:r>
-        <w:rPr>
-          <w:rStyle w:val="VerbatimChar"/>
-        </w:rPr>
-        <w:t xml:space="preserve">alice.pub</w:t>
-      </w:r>
-      <w:r>
-        <w:t xml:space="preserve"> </w:t>
-      </w:r>
-      <w:r>
-        <w:t xml:space="preserve">no diretório em que você cai —</w:t>
-      </w:r>
-      <w:r>
-        <w:t xml:space="preserve"> </w:t>
-      </w:r>
-      <w:r>
-        <w:t xml:space="preserve">um</w:t>
-      </w:r>
-      <w:r>
-        <w:t xml:space="preserve"> </w:t>
-      </w:r>
-      <w:r>
-        <w:rPr>
-          <w:rStyle w:val="VerbatimChar"/>
-        </w:rPr>
-        <w:t xml:space="preserve">ls</w:t>
-      </w:r>
-      <w:r>
-        <w:t xml:space="preserve"> </w:t>
-      </w:r>
-      <w:r>
-        <w:t xml:space="preserve">mostra. Quando estiver no terminal, comece quando o facilitador disser.</w:t>
-      </w:r>
-    </w:p>
-    <w:p>
-      <w:r>
-        <w:pict>
-          <v:rect style="width:0;height:1.5pt" o:hralign="center" o:hrstd="t" o:hr="t"/>
-        </w:pict>
-      </w:r>
-    </w:p>
-    <w:bookmarkEnd w:id="20"/>
-    <w:bookmarkStart w:id="31" w:name="cenário"/>
-    <w:p>
-      <w:pPr>
-        <w:pStyle w:val="Heading2"/>
-      </w:pPr>
-      <w:r>
-        <w:t xml:space="preserve">Cenário</w:t>
-      </w:r>
-    </w:p>
-    <w:p>
-      <w:pPr>
-        <w:pStyle w:val="FirstParagraph"/>
-      </w:pPr>
-      <w:r>
-        <w:t xml:space="preserve">Você entrou esta semana como pessoa</w:t>
-      </w:r>
-      <w:r>
-        <w:t xml:space="preserve"> </w:t>
-      </w:r>
-      <w:r>
-        <w:rPr>
-          <w:bCs/>
-          <w:b/>
-        </w:rPr>
-        <w:t xml:space="preserve">SRE / administradora de sistemas</w:t>
-      </w:r>
-      <w:r>
-        <w:t xml:space="preserve"> </w:t>
-      </w:r>
-      <w:r>
-        <w:t xml:space="preserve">numa empresa. A frota é</w:t>
-      </w:r>
-      <w:r>
-        <w:t xml:space="preserve"> </w:t>
-      </w:r>
-      <w:r>
-        <w:t xml:space="preserve">pequena — três servidores Linux:</w:t>
+        <w:t xml:space="preserve">Você recebeu (por mensagem)</w:t>
+      </w:r>
+      <w:r>
+        <w:t xml:space="preserve"> </w:t>
+      </w:r>
+      <w:r>
+        <w:rPr>
+          <w:bCs/>
+          <w:b/>
+        </w:rPr>
+        <w:t xml:space="preserve">dois arquivos</w:t>
+      </w:r>
+      <w:r>
+        <w:t xml:space="preserve">:</w:t>
       </w:r>
     </w:p>
     <w:p>
@@ -374,35 +173,23 @@
         <w:pStyle w:val="Compact"/>
       </w:pPr>
       <w:r>
-        <w:rPr>
-          <w:rStyle w:val="VerbatimChar"/>
-          <w:bCs/>
-          <w:b/>
-        </w:rPr>
-        <w:t xml:space="preserve">web-01</w:t>
-      </w:r>
-      <w:r>
-        <w:t xml:space="preserve"> </w:t>
-      </w:r>
-      <w:r>
-        <w:t xml:space="preserve">e</w:t>
-      </w:r>
-      <w:r>
-        <w:t xml:space="preserve"> </w:t>
-      </w:r>
-      <w:r>
-        <w:rPr>
-          <w:rStyle w:val="VerbatimChar"/>
-          <w:bCs/>
-          <w:b/>
-        </w:rPr>
-        <w:t xml:space="preserve">web-02</w:t>
-      </w:r>
-      <w:r>
-        <w:t xml:space="preserve"> </w:t>
-      </w:r>
-      <w:r>
-        <w:t xml:space="preserve">— servidores de aplicação;</w:t>
+        <w:t xml:space="preserve">a</w:t>
+      </w:r>
+      <w:r>
+        <w:t xml:space="preserve"> </w:t>
+      </w:r>
+      <w:r>
+        <w:rPr>
+          <w:bCs/>
+          <w:b/>
+        </w:rPr>
+        <w:t xml:space="preserve">chave SSH privada</w:t>
+      </w:r>
+      <w:r>
+        <w:t xml:space="preserve"> </w:t>
+      </w:r>
+      <w:r>
+        <w:t xml:space="preserve">que te autentica no servidor (o nome do arquivo está na mensagem);</w:t>
       </w:r>
     </w:p>
     <w:p>
@@ -415,17 +202,13 @@
       </w:pPr>
       <w:r>
         <w:rPr>
-          <w:rStyle w:val="VerbatimChar"/>
-          <w:bCs/>
-          <w:b/>
-        </w:rPr>
-        <w:t xml:space="preserve">db-03</w:t>
-      </w:r>
-      <w:r>
-        <w:t xml:space="preserve"> </w:t>
-      </w:r>
-      <w:r>
-        <w:t xml:space="preserve">— banco de dados.</w:t>
+          <w:bCs/>
+          <w:b/>
+        </w:rPr>
+        <w:t xml:space="preserve">este roteiro</w:t>
+      </w:r>
+      <w:r>
+        <w:t xml:space="preserve">.</w:t>
       </w:r>
     </w:p>
     <w:p>
@@ -433,7 +216,71 @@
         <w:pStyle w:val="FirstParagraph"/>
       </w:pPr>
       <w:r>
-        <w:t xml:space="preserve">A empresa controla</w:t>
+        <w:t xml:space="preserve">Junto, a mensagem também traz três dados específicos da sessão (são esses que você usa nos</w:t>
+      </w:r>
+      <w:r>
+        <w:t xml:space="preserve"> </w:t>
+      </w:r>
+      <w:r>
+        <w:t xml:space="preserve">comandos abaixo no lugar dos placeholders entre</w:t>
+      </w:r>
+      <w:r>
+        <w:t xml:space="preserve"> </w:t>
+      </w:r>
+      <w:r>
+        <w:rPr>
+          <w:rStyle w:val="VerbatimChar"/>
+        </w:rPr>
+        <w:t xml:space="preserve">&lt; &gt;</w:t>
+      </w:r>
+      <w:r>
+        <w:t xml:space="preserve">):</w:t>
+      </w:r>
+    </w:p>
+    <w:p>
+      <w:pPr>
+        <w:numPr>
+          <w:ilvl w:val="0"/>
+          <w:numId w:val="1002"/>
+        </w:numPr>
+        <w:pStyle w:val="Compact"/>
+      </w:pPr>
+      <w:r>
+        <w:rPr>
+          <w:rStyle w:val="VerbatimChar"/>
+          <w:bCs/>
+          <w:b/>
+        </w:rPr>
+        <w:t xml:space="preserve">&lt;usuario&gt;@&lt;endereço-do-servidor&gt;</w:t>
+      </w:r>
+      <w:r>
+        <w:t xml:space="preserve"> </w:t>
+      </w:r>
+      <w:r>
+        <w:t xml:space="preserve">— onde você vai se conectar;</w:t>
+      </w:r>
+    </w:p>
+    <w:p>
+      <w:pPr>
+        <w:numPr>
+          <w:ilvl w:val="0"/>
+          <w:numId w:val="1002"/>
+        </w:numPr>
+        <w:pStyle w:val="Compact"/>
+      </w:pPr>
+      <w:r>
+        <w:rPr>
+          <w:rStyle w:val="VerbatimChar"/>
+          <w:bCs/>
+          <w:b/>
+        </w:rPr>
+        <w:t xml:space="preserve">&lt;fingerprint&gt;</w:t>
+      </w:r>
+      <w:r>
+        <w:t xml:space="preserve"> </w:t>
+      </w:r>
+      <w:r>
+        <w:t xml:space="preserve">— o</w:t>
       </w:r>
       <w:r>
         <w:t xml:space="preserve"> </w:t>
@@ -443,44 +290,631 @@
           <w:iCs/>
           <w:i/>
         </w:rPr>
-        <w:t xml:space="preserve">quem tem acesso SSH e sudo</w:t>
-      </w:r>
-      <w:r>
-        <w:t xml:space="preserve"> </w:t>
-      </w:r>
-      <w:r>
-        <w:t xml:space="preserve">a esses servidores com uma ferramenta de linha de</w:t>
-      </w:r>
-      <w:r>
-        <w:t xml:space="preserve"> </w:t>
-      </w:r>
-      <w:r>
-        <w:t xml:space="preserve">comando chamada</w:t>
-      </w:r>
-      <w:r>
-        <w:t xml:space="preserve"> </w:t>
-      </w:r>
-      <w:r>
-        <w:rPr>
-          <w:bCs/>
-          <w:b/>
-        </w:rPr>
-        <w:t xml:space="preserve">AdminForge</w:t>
-      </w:r>
-      <w:r>
-        <w:t xml:space="preserve">, que você vai operar a partir deste terminal. Uma coisa importante: o</w:t>
-      </w:r>
-      <w:r>
-        <w:t xml:space="preserve"> </w:t>
-      </w:r>
-      <w:r>
-        <w:t xml:space="preserve">que você muda na ferramenta só vai de fato para os servidores quando você mandar — faz parte do</w:t>
-      </w:r>
-      <w:r>
-        <w:t xml:space="preserve"> </w:t>
-      </w:r>
-      <w:r>
-        <w:t xml:space="preserve">trabalho descobrir como.</w:t>
+        <w:t xml:space="preserve">fingerprint</w:t>
+      </w:r>
+      <w:r>
+        <w:t xml:space="preserve"> </w:t>
+      </w:r>
+      <w:r>
+        <w:t xml:space="preserve">do servidor (pra confirmar na primeira conexão);</w:t>
+      </w:r>
+    </w:p>
+    <w:p>
+      <w:pPr>
+        <w:numPr>
+          <w:ilvl w:val="0"/>
+          <w:numId w:val="1002"/>
+        </w:numPr>
+        <w:pStyle w:val="Compact"/>
+      </w:pPr>
+      <w:r>
+        <w:rPr>
+          <w:rStyle w:val="VerbatimChar"/>
+          <w:bCs/>
+          <w:b/>
+        </w:rPr>
+        <w:t xml:space="preserve">&lt;chave&gt;</w:t>
+      </w:r>
+      <w:r>
+        <w:t xml:space="preserve"> </w:t>
+      </w:r>
+      <w:r>
+        <w:t xml:space="preserve">— o nome do arquivo de chave que veio na mensagem.</w:t>
+      </w:r>
+    </w:p>
+    <w:bookmarkStart w:id="20" w:name="salvar-a-chave-e-proteger-as-permissões"/>
+    <w:p>
+      <w:pPr>
+        <w:pStyle w:val="Heading3"/>
+      </w:pPr>
+      <w:r>
+        <w:t xml:space="preserve">1. Salvar a chave e proteger as permissões</w:t>
+      </w:r>
+    </w:p>
+    <w:p>
+      <w:pPr>
+        <w:pStyle w:val="FirstParagraph"/>
+      </w:pPr>
+      <w:r>
+        <w:t xml:space="preserve">No terminal da</w:t>
+      </w:r>
+      <w:r>
+        <w:t xml:space="preserve"> </w:t>
+      </w:r>
+      <w:r>
+        <w:rPr>
+          <w:bCs/>
+          <w:b/>
+        </w:rPr>
+        <w:t xml:space="preserve">sua máquina</w:t>
+      </w:r>
+      <w:r>
+        <w:t xml:space="preserve"> </w:t>
+      </w:r>
+      <w:r>
+        <w:t xml:space="preserve">(Linux/Mac, ou Windows 10+ com o</w:t>
+      </w:r>
+      <w:r>
+        <w:t xml:space="preserve"> </w:t>
+      </w:r>
+      <w:r>
+        <w:rPr>
+          <w:rStyle w:val="VerbatimChar"/>
+        </w:rPr>
+        <w:t xml:space="preserve">ssh</w:t>
+      </w:r>
+      <w:r>
+        <w:t xml:space="preserve"> </w:t>
+      </w:r>
+      <w:r>
+        <w:t xml:space="preserve">do PowerShell):</w:t>
+      </w:r>
+    </w:p>
+    <w:p>
+      <w:pPr>
+        <w:pStyle w:val="SourceCode"/>
+      </w:pPr>
+      <w:r>
+        <w:rPr>
+          <w:rStyle w:val="FunctionTok"/>
+        </w:rPr>
+        <w:t xml:space="preserve">mkdir</w:t>
+      </w:r>
+      <w:r>
+        <w:rPr>
+          <w:rStyle w:val="NormalTok"/>
+        </w:rPr>
+        <w:t xml:space="preserve"> </w:t>
+      </w:r>
+      <w:r>
+        <w:rPr>
+          <w:rStyle w:val="AttributeTok"/>
+        </w:rPr>
+        <w:t xml:space="preserve">-p</w:t>
+      </w:r>
+      <w:r>
+        <w:rPr>
+          <w:rStyle w:val="NormalTok"/>
+        </w:rPr>
+        <w:t xml:space="preserve"> ~/.ssh</w:t>
+      </w:r>
+      <w:r>
+        <w:br/>
+      </w:r>
+      <w:r>
+        <w:rPr>
+          <w:rStyle w:val="FunctionTok"/>
+        </w:rPr>
+        <w:t xml:space="preserve">mv</w:t>
+      </w:r>
+      <w:r>
+        <w:rPr>
+          <w:rStyle w:val="NormalTok"/>
+        </w:rPr>
+        <w:t xml:space="preserve"> </w:t>
+      </w:r>
+      <w:r>
+        <w:rPr>
+          <w:rStyle w:val="OperatorTok"/>
+        </w:rPr>
+        <w:t xml:space="preserve">&lt;</w:t>
+      </w:r>
+      <w:r>
+        <w:rPr>
+          <w:rStyle w:val="NormalTok"/>
+        </w:rPr>
+        <w:t xml:space="preserve">chave</w:t>
+      </w:r>
+      <w:r>
+        <w:rPr>
+          <w:rStyle w:val="OperatorTok"/>
+        </w:rPr>
+        <w:t xml:space="preserve">&gt;</w:t>
+      </w:r>
+      <w:r>
+        <w:rPr>
+          <w:rStyle w:val="NormalTok"/>
+        </w:rPr>
+        <w:t xml:space="preserve"> ~/.ssh/</w:t>
+      </w:r>
+      <w:r>
+        <w:br/>
+      </w:r>
+      <w:r>
+        <w:rPr>
+          <w:rStyle w:val="FunctionTok"/>
+        </w:rPr>
+        <w:t xml:space="preserve">chmod</w:t>
+      </w:r>
+      <w:r>
+        <w:rPr>
+          <w:rStyle w:val="NormalTok"/>
+        </w:rPr>
+        <w:t xml:space="preserve"> 600 ~/.ssh/</w:t>
+      </w:r>
+      <w:r>
+        <w:rPr>
+          <w:rStyle w:val="OperatorTok"/>
+        </w:rPr>
+        <w:t xml:space="preserve">&lt;</w:t>
+      </w:r>
+      <w:r>
+        <w:rPr>
+          <w:rStyle w:val="NormalTok"/>
+        </w:rPr>
+        <w:t xml:space="preserve">chave</w:t>
+      </w:r>
+      <w:r>
+        <w:rPr>
+          <w:rStyle w:val="OperatorTok"/>
+        </w:rPr>
+        <w:t xml:space="preserve">&gt;</w:t>
+      </w:r>
+    </w:p>
+    <w:p>
+      <w:pPr>
+        <w:pStyle w:val="FirstParagraph"/>
+      </w:pPr>
+      <w:r>
+        <w:t xml:space="preserve">O</w:t>
+      </w:r>
+      <w:r>
+        <w:t xml:space="preserve"> </w:t>
+      </w:r>
+      <w:r>
+        <w:rPr>
+          <w:rStyle w:val="VerbatimChar"/>
+        </w:rPr>
+        <w:t xml:space="preserve">chmod 600</w:t>
+      </w:r>
+      <w:r>
+        <w:t xml:space="preserve"> </w:t>
+      </w:r>
+      <w:r>
+        <w:t xml:space="preserve">é obrigatório — o</w:t>
+      </w:r>
+      <w:r>
+        <w:t xml:space="preserve"> </w:t>
+      </w:r>
+      <w:r>
+        <w:rPr>
+          <w:rStyle w:val="VerbatimChar"/>
+        </w:rPr>
+        <w:t xml:space="preserve">ssh</w:t>
+      </w:r>
+      <w:r>
+        <w:t xml:space="preserve"> </w:t>
+      </w:r>
+      <w:r>
+        <w:t xml:space="preserve">recusa chaves com permissões abertas.</w:t>
+      </w:r>
+    </w:p>
+    <w:bookmarkEnd w:id="20"/>
+    <w:bookmarkStart w:id="21" w:name="conectar"/>
+    <w:p>
+      <w:pPr>
+        <w:pStyle w:val="Heading3"/>
+      </w:pPr>
+      <w:r>
+        <w:t xml:space="preserve">2. Conectar</w:t>
+      </w:r>
+    </w:p>
+    <w:p>
+      <w:pPr>
+        <w:pStyle w:val="SourceCode"/>
+      </w:pPr>
+      <w:r>
+        <w:rPr>
+          <w:rStyle w:val="FunctionTok"/>
+        </w:rPr>
+        <w:t xml:space="preserve">ssh</w:t>
+      </w:r>
+      <w:r>
+        <w:rPr>
+          <w:rStyle w:val="NormalTok"/>
+        </w:rPr>
+        <w:t xml:space="preserve"> </w:t>
+      </w:r>
+      <w:r>
+        <w:rPr>
+          <w:rStyle w:val="AttributeTok"/>
+        </w:rPr>
+        <w:t xml:space="preserve">-i</w:t>
+      </w:r>
+      <w:r>
+        <w:rPr>
+          <w:rStyle w:val="NormalTok"/>
+        </w:rPr>
+        <w:t xml:space="preserve"> ~/.ssh/</w:t>
+      </w:r>
+      <w:r>
+        <w:rPr>
+          <w:rStyle w:val="OperatorTok"/>
+        </w:rPr>
+        <w:t xml:space="preserve">&lt;</w:t>
+      </w:r>
+      <w:r>
+        <w:rPr>
+          <w:rStyle w:val="NormalTok"/>
+        </w:rPr>
+        <w:t xml:space="preserve">chave</w:t>
+      </w:r>
+      <w:r>
+        <w:rPr>
+          <w:rStyle w:val="OperatorTok"/>
+        </w:rPr>
+        <w:t xml:space="preserve">&gt;</w:t>
+      </w:r>
+      <w:r>
+        <w:rPr>
+          <w:rStyle w:val="NormalTok"/>
+        </w:rPr>
+        <w:t xml:space="preserve"> </w:t>
+      </w:r>
+      <w:r>
+        <w:rPr>
+          <w:rStyle w:val="OperatorTok"/>
+        </w:rPr>
+        <w:t xml:space="preserve">&lt;</w:t>
+      </w:r>
+      <w:r>
+        <w:rPr>
+          <w:rStyle w:val="NormalTok"/>
+        </w:rPr>
+        <w:t xml:space="preserve">usuario</w:t>
+      </w:r>
+      <w:r>
+        <w:rPr>
+          <w:rStyle w:val="OperatorTok"/>
+        </w:rPr>
+        <w:t xml:space="preserve">&gt;</w:t>
+      </w:r>
+      <w:r>
+        <w:rPr>
+          <w:rStyle w:val="NormalTok"/>
+        </w:rPr>
+        <w:t xml:space="preserve">@</w:t>
+      </w:r>
+      <w:r>
+        <w:rPr>
+          <w:rStyle w:val="OperatorTok"/>
+        </w:rPr>
+        <w:t xml:space="preserve">&lt;</w:t>
+      </w:r>
+      <w:r>
+        <w:rPr>
+          <w:rStyle w:val="NormalTok"/>
+        </w:rPr>
+        <w:t xml:space="preserve">endereço-do-servidor</w:t>
+      </w:r>
+      <w:r>
+        <w:rPr>
+          <w:rStyle w:val="OperatorTok"/>
+        </w:rPr>
+        <w:t xml:space="preserve">&gt;</w:t>
+      </w:r>
+    </w:p>
+    <w:p>
+      <w:pPr>
+        <w:pStyle w:val="FirstParagraph"/>
+      </w:pPr>
+      <w:r>
+        <w:rPr>
+          <w:bCs/>
+          <w:b/>
+        </w:rPr>
+        <w:t xml:space="preserve">Na primeira conexão</w:t>
+      </w:r>
+      <w:r>
+        <w:t xml:space="preserve">, o</w:t>
+      </w:r>
+      <w:r>
+        <w:t xml:space="preserve"> </w:t>
+      </w:r>
+      <w:r>
+        <w:rPr>
+          <w:rStyle w:val="VerbatimChar"/>
+        </w:rPr>
+        <w:t xml:space="preserve">ssh</w:t>
+      </w:r>
+      <w:r>
+        <w:t xml:space="preserve"> </w:t>
+      </w:r>
+      <w:r>
+        <w:t xml:space="preserve">mostra o</w:t>
+      </w:r>
+      <w:r>
+        <w:t xml:space="preserve"> </w:t>
+      </w:r>
+      <w:r>
+        <w:rPr>
+          <w:iCs/>
+          <w:i/>
+        </w:rPr>
+        <w:t xml:space="preserve">fingerprint</w:t>
+      </w:r>
+      <w:r>
+        <w:t xml:space="preserve"> </w:t>
+      </w:r>
+      <w:r>
+        <w:t xml:space="preserve">do servidor e pergunta se você confia.</w:t>
+      </w:r>
+      <w:r>
+        <w:t xml:space="preserve"> </w:t>
+      </w:r>
+      <w:r>
+        <w:t xml:space="preserve">Responda</w:t>
+      </w:r>
+      <w:r>
+        <w:t xml:space="preserve"> </w:t>
+      </w:r>
+      <w:r>
+        <w:rPr>
+          <w:rStyle w:val="VerbatimChar"/>
+        </w:rPr>
+        <w:t xml:space="preserve">yes</w:t>
+      </w:r>
+      <w:r>
+        <w:t xml:space="preserve"> </w:t>
+      </w:r>
+      <w:r>
+        <w:rPr>
+          <w:bCs/>
+          <w:b/>
+        </w:rPr>
+        <w:t xml:space="preserve">somente se</w:t>
+      </w:r>
+      <w:r>
+        <w:t xml:space="preserve"> </w:t>
+      </w:r>
+      <w:r>
+        <w:t xml:space="preserve">o fingerprint na tela bater</w:t>
+      </w:r>
+      <w:r>
+        <w:t xml:space="preserve"> </w:t>
+      </w:r>
+      <w:r>
+        <w:rPr>
+          <w:bCs/>
+          <w:b/>
+        </w:rPr>
+        <w:t xml:space="preserve">exatamente</w:t>
+      </w:r>
+      <w:r>
+        <w:t xml:space="preserve"> </w:t>
+      </w:r>
+      <w:r>
+        <w:t xml:space="preserve">com o</w:t>
+      </w:r>
+      <w:r>
+        <w:t xml:space="preserve"> </w:t>
+      </w:r>
+      <w:r>
+        <w:rPr>
+          <w:rStyle w:val="VerbatimChar"/>
+        </w:rPr>
+        <w:t xml:space="preserve">&lt;fingerprint&gt;</w:t>
+      </w:r>
+      <w:r>
+        <w:t xml:space="preserve"> </w:t>
+      </w:r>
+      <w:r>
+        <w:t xml:space="preserve">que</w:t>
+      </w:r>
+      <w:r>
+        <w:t xml:space="preserve"> </w:t>
+      </w:r>
+      <w:r>
+        <w:t xml:space="preserve">veio na mensagem.</w:t>
+      </w:r>
+    </w:p>
+    <w:bookmarkEnd w:id="21"/>
+    <w:bookmarkStart w:id="22" w:name="já-está-dentro"/>
+    <w:p>
+      <w:pPr>
+        <w:pStyle w:val="Heading3"/>
+      </w:pPr>
+      <w:r>
+        <w:t xml:space="preserve">3. Já está dentro</w:t>
+      </w:r>
+    </w:p>
+    <w:p>
+      <w:pPr>
+        <w:pStyle w:val="FirstParagraph"/>
+      </w:pPr>
+      <w:r>
+        <w:t xml:space="preserve">Quando você vir um prompt do tipo</w:t>
+      </w:r>
+      <w:r>
+        <w:t xml:space="preserve"> </w:t>
+      </w:r>
+      <w:r>
+        <w:rPr>
+          <w:rStyle w:val="VerbatimChar"/>
+        </w:rPr>
+        <w:t xml:space="preserve">&lt;usuario&gt;@&lt;host&gt;:.../lab$</w:t>
+      </w:r>
+      <w:r>
+        <w:t xml:space="preserve">, está tudo pronto:</w:t>
+      </w:r>
+    </w:p>
+    <w:p>
+      <w:pPr>
+        <w:numPr>
+          <w:ilvl w:val="0"/>
+          <w:numId w:val="1003"/>
+        </w:numPr>
+        <w:pStyle w:val="Compact"/>
+      </w:pPr>
+      <w:r>
+        <w:t xml:space="preserve">a ferramenta</w:t>
+      </w:r>
+      <w:r>
+        <w:t xml:space="preserve"> </w:t>
+      </w:r>
+      <w:r>
+        <w:rPr>
+          <w:rStyle w:val="VerbatimChar"/>
+          <w:bCs/>
+          <w:b/>
+        </w:rPr>
+        <w:t xml:space="preserve">adminforge</w:t>
+      </w:r>
+      <w:r>
+        <w:t xml:space="preserve"> </w:t>
+      </w:r>
+      <w:r>
+        <w:t xml:space="preserve">já está no</w:t>
+      </w:r>
+      <w:r>
+        <w:t xml:space="preserve"> </w:t>
+      </w:r>
+      <w:r>
+        <w:rPr>
+          <w:rStyle w:val="VerbatimChar"/>
+        </w:rPr>
+        <w:t xml:space="preserve">PATH</w:t>
+      </w:r>
+      <w:r>
+        <w:t xml:space="preserve"> </w:t>
+      </w:r>
+      <w:r>
+        <w:t xml:space="preserve">(atalho:</w:t>
+      </w:r>
+      <w:r>
+        <w:t xml:space="preserve"> </w:t>
+      </w:r>
+      <w:r>
+        <w:rPr>
+          <w:rStyle w:val="VerbatimChar"/>
+          <w:bCs/>
+          <w:b/>
+        </w:rPr>
+        <w:t xml:space="preserve">af</w:t>
+      </w:r>
+      <w:r>
+        <w:t xml:space="preserve">);</w:t>
+      </w:r>
+    </w:p>
+    <w:p>
+      <w:pPr>
+        <w:numPr>
+          <w:ilvl w:val="0"/>
+          <w:numId w:val="1003"/>
+        </w:numPr>
+        <w:pStyle w:val="Compact"/>
+      </w:pPr>
+      <w:r>
+        <w:rPr>
+          <w:bCs/>
+          <w:b/>
+        </w:rPr>
+        <w:t xml:space="preserve">autocomplete</w:t>
+      </w:r>
+      <w:r>
+        <w:t xml:space="preserve"> </w:t>
+      </w:r>
+      <w:r>
+        <w:t xml:space="preserve">funciona com</w:t>
+      </w:r>
+      <w:r>
+        <w:t xml:space="preserve"> </w:t>
+      </w:r>
+      <w:r>
+        <w:rPr>
+          <w:rStyle w:val="VerbatimChar"/>
+        </w:rPr>
+        <w:t xml:space="preserve">Tab</w:t>
+      </w:r>
+      <w:r>
+        <w:t xml:space="preserve"> </w:t>
+      </w:r>
+      <w:r>
+        <w:t xml:space="preserve">(subcomandos, flags e valores cadastrados);</w:t>
+      </w:r>
+    </w:p>
+    <w:p>
+      <w:pPr>
+        <w:numPr>
+          <w:ilvl w:val="0"/>
+          <w:numId w:val="1003"/>
+        </w:numPr>
+        <w:pStyle w:val="Compact"/>
+      </w:pPr>
+      <w:r>
+        <w:t xml:space="preserve">o arquivo</w:t>
+      </w:r>
+      <w:r>
+        <w:t xml:space="preserve"> </w:t>
+      </w:r>
+      <w:r>
+        <w:rPr>
+          <w:rStyle w:val="VerbatimChar"/>
+          <w:bCs/>
+          <w:b/>
+        </w:rPr>
+        <w:t xml:space="preserve">alice.pub</w:t>
+      </w:r>
+      <w:r>
+        <w:t xml:space="preserve"> </w:t>
+      </w:r>
+      <w:r>
+        <w:t xml:space="preserve">(vai precisar na Tarefa 1) está no diretório em que você cai — confere com</w:t>
+      </w:r>
+      <w:r>
+        <w:t xml:space="preserve"> </w:t>
+      </w:r>
+      <w:r>
+        <w:rPr>
+          <w:rStyle w:val="VerbatimChar"/>
+        </w:rPr>
+        <w:t xml:space="preserve">ls</w:t>
+      </w:r>
+      <w:r>
+        <w:t xml:space="preserve">.</w:t>
+      </w:r>
+    </w:p>
+    <w:p>
+      <w:pPr>
+        <w:pStyle w:val="FirstParagraph"/>
+      </w:pPr>
+      <w:r>
+        <w:t xml:space="preserve">Não precisa instalar nada na sua máquina além do cliente</w:t>
+      </w:r>
+      <w:r>
+        <w:t xml:space="preserve"> </w:t>
+      </w:r>
+      <w:r>
+        <w:rPr>
+          <w:rStyle w:val="VerbatimChar"/>
+        </w:rPr>
+        <w:t xml:space="preserve">ssh</w:t>
+      </w:r>
+      <w:r>
+        <w:t xml:space="preserve"> </w:t>
+      </w:r>
+      <w:r>
+        <w:t xml:space="preserve">(já vem em Linux/Mac, e Windows 10+ tem por padrão no PowerShell). Quando estiver com o prompt aberto, comece quando o facilitador (ou a mensagem) avisar.</w:t>
       </w:r>
     </w:p>
     <w:p>
@@ -490,13 +924,15 @@
         </w:pict>
       </w:r>
     </w:p>
-    <w:bookmarkStart w:id="21" w:name="tarefa-0-primeira-impressão-aquecimento"/>
-    <w:p>
-      <w:pPr>
-        <w:pStyle w:val="Heading3"/>
-      </w:pPr>
-      <w:r>
-        <w:t xml:space="preserve">Tarefa 0 — Primeira impressão (aquecimento)</w:t>
+    <w:bookmarkEnd w:id="22"/>
+    <w:bookmarkEnd w:id="23"/>
+    <w:bookmarkStart w:id="34" w:name="cenário"/>
+    <w:p>
+      <w:pPr>
+        <w:pStyle w:val="Heading2"/>
+      </w:pPr>
+      <w:r>
+        <w:t xml:space="preserve">Cenário</w:t>
       </w:r>
     </w:p>
     <w:p>
@@ -504,105 +940,147 @@
         <w:pStyle w:val="FirstParagraph"/>
       </w:pPr>
       <w:r>
-        <w:t xml:space="preserve">Rode</w:t>
-      </w:r>
-      <w:r>
-        <w:t xml:space="preserve"> </w:t>
-      </w:r>
-      <w:r>
-        <w:rPr>
-          <w:rStyle w:val="VerbatimChar"/>
-        </w:rPr>
-        <w:t xml:space="preserve">adminforge --help</w:t>
-      </w:r>
-      <w:r>
-        <w:t xml:space="preserve">. Em voz alta: na sua leitura,</w:t>
-      </w:r>
-      <w:r>
-        <w:t xml:space="preserve"> </w:t>
-      </w:r>
-      <w:r>
-        <w:rPr>
-          <w:bCs/>
-          <w:b/>
-        </w:rPr>
-        <w:t xml:space="preserve">o que essa ferramenta faz?</w:t>
-      </w:r>
-      <w:r>
-        <w:t xml:space="preserve"> </w:t>
-      </w:r>
-      <w:r>
-        <w:t xml:space="preserve">Se tivesse que</w:t>
-      </w:r>
-      <w:r>
-        <w:t xml:space="preserve"> </w:t>
-      </w:r>
-      <w:r>
-        <w:t xml:space="preserve">começar do zero,</w:t>
-      </w:r>
-      <w:r>
-        <w:t xml:space="preserve"> </w:t>
-      </w:r>
-      <w:r>
-        <w:rPr>
-          <w:bCs/>
-          <w:b/>
-        </w:rPr>
-        <w:t xml:space="preserve">por onde começaria?</w:t>
-      </w:r>
-    </w:p>
-    <w:p>
-      <w:pPr>
-        <w:pStyle w:val="BodyText"/>
-      </w:pPr>
+        <w:t xml:space="preserve">Você entrou esta semana como pessoa</w:t>
+      </w:r>
+      <w:r>
+        <w:t xml:space="preserve"> </w:t>
+      </w:r>
+      <w:r>
+        <w:rPr>
+          <w:bCs/>
+          <w:b/>
+        </w:rPr>
+        <w:t xml:space="preserve">SRE / administradora de sistemas</w:t>
+      </w:r>
+      <w:r>
+        <w:t xml:space="preserve"> </w:t>
+      </w:r>
+      <w:r>
+        <w:t xml:space="preserve">numa empresa. A frota é</w:t>
+      </w:r>
+      <w:r>
+        <w:t xml:space="preserve"> </w:t>
+      </w:r>
+      <w:r>
+        <w:t xml:space="preserve">pequena — três servidores Linux:</w:t>
+      </w:r>
+    </w:p>
+    <w:p>
+      <w:pPr>
+        <w:numPr>
+          <w:ilvl w:val="0"/>
+          <w:numId w:val="1004"/>
+        </w:numPr>
+        <w:pStyle w:val="Compact"/>
+      </w:pPr>
+      <w:r>
+        <w:rPr>
+          <w:rStyle w:val="VerbatimChar"/>
+          <w:bCs/>
+          <w:b/>
+        </w:rPr>
+        <w:t xml:space="preserve">web-01</w:t>
+      </w:r>
+      <w:r>
+        <w:t xml:space="preserve"> </w:t>
+      </w:r>
+      <w:r>
+        <w:t xml:space="preserve">e</w:t>
+      </w:r>
+      <w:r>
+        <w:t xml:space="preserve"> </w:t>
+      </w:r>
+      <w:r>
+        <w:rPr>
+          <w:rStyle w:val="VerbatimChar"/>
+          <w:bCs/>
+          <w:b/>
+        </w:rPr>
+        <w:t xml:space="preserve">web-02</w:t>
+      </w:r>
+      <w:r>
+        <w:t xml:space="preserve"> </w:t>
+      </w:r>
+      <w:r>
+        <w:t xml:space="preserve">— servidores de aplicação;</w:t>
+      </w:r>
+    </w:p>
+    <w:p>
+      <w:pPr>
+        <w:numPr>
+          <w:ilvl w:val="0"/>
+          <w:numId w:val="1004"/>
+        </w:numPr>
+        <w:pStyle w:val="Compact"/>
+      </w:pPr>
+      <w:r>
+        <w:rPr>
+          <w:rStyle w:val="VerbatimChar"/>
+          <w:bCs/>
+          <w:b/>
+        </w:rPr>
+        <w:t xml:space="preserve">db-03</w:t>
+      </w:r>
+      <w:r>
+        <w:t xml:space="preserve"> </w:t>
+      </w:r>
+      <w:r>
+        <w:t xml:space="preserve">— banco de dados.</w:t>
+      </w:r>
+    </w:p>
+    <w:p>
+      <w:pPr>
+        <w:pStyle w:val="FirstParagraph"/>
+      </w:pPr>
+      <w:r>
+        <w:t xml:space="preserve">A empresa controla</w:t>
+      </w:r>
+      <w:r>
+        <w:t xml:space="preserve"> </w:t>
+      </w:r>
       <w:r>
         <w:rPr>
           <w:iCs/>
           <w:i/>
         </w:rPr>
-        <w:t xml:space="preserve">(Não precisa</w:t>
-      </w:r>
-      <w:r>
-        <w:rPr>
-          <w:iCs/>
-          <w:i/>
-        </w:rPr>
-        <w:t xml:space="preserve"> </w:t>
-      </w:r>
-      <w:r>
-        <w:rPr>
-          <w:iCs/>
-          <w:i/>
-        </w:rPr>
-        <w:t xml:space="preserve">“</w:t>
-      </w:r>
-      <w:r>
-        <w:rPr>
-          <w:iCs/>
-          <w:i/>
-        </w:rPr>
-        <w:t xml:space="preserve">concluir</w:t>
-      </w:r>
-      <w:r>
-        <w:rPr>
-          <w:iCs/>
-          <w:i/>
-        </w:rPr>
-        <w:t xml:space="preserve">”</w:t>
-      </w:r>
-      <w:r>
-        <w:rPr>
-          <w:iCs/>
-          <w:i/>
-        </w:rPr>
-        <w:t xml:space="preserve"> </w:t>
-      </w:r>
-      <w:r>
-        <w:rPr>
-          <w:iCs/>
-          <w:i/>
-        </w:rPr>
-        <w:t xml:space="preserve">nada aqui — é só pra calibrar e ouvir sua primeira impressão.)</w:t>
+        <w:t xml:space="preserve">quem tem acesso SSH e sudo</w:t>
+      </w:r>
+      <w:r>
+        <w:t xml:space="preserve"> </w:t>
+      </w:r>
+      <w:r>
+        <w:t xml:space="preserve">a esses servidores com uma ferramenta de linha de</w:t>
+      </w:r>
+      <w:r>
+        <w:t xml:space="preserve"> </w:t>
+      </w:r>
+      <w:r>
+        <w:t xml:space="preserve">comando chamada</w:t>
+      </w:r>
+      <w:r>
+        <w:t xml:space="preserve"> </w:t>
+      </w:r>
+      <w:r>
+        <w:rPr>
+          <w:bCs/>
+          <w:b/>
+        </w:rPr>
+        <w:t xml:space="preserve">AdminForge</w:t>
+      </w:r>
+      <w:r>
+        <w:t xml:space="preserve">, que você vai operar a partir deste terminal. Uma coisa importante: o</w:t>
+      </w:r>
+      <w:r>
+        <w:t xml:space="preserve"> </w:t>
+      </w:r>
+      <w:r>
+        <w:t xml:space="preserve">que você muda na ferramenta só vai de fato para os servidores quando você mandar — faz parte do</w:t>
+      </w:r>
+      <w:r>
+        <w:t xml:space="preserve"> </w:t>
+      </w:r>
+      <w:r>
+        <w:t xml:space="preserve">trabalho descobrir como.</w:t>
       </w:r>
     </w:p>
     <w:p>
@@ -612,14 +1090,13 @@
         </w:pict>
       </w:r>
     </w:p>
-    <w:bookmarkEnd w:id="21"/>
-    <w:bookmarkStart w:id="22" w:name="Xd31e8334c4ba1e898b6c64749136017d9c9839a"/>
+    <w:bookmarkStart w:id="24" w:name="tarefa-0-primeira-impressão-aquecimento"/>
     <w:p>
       <w:pPr>
         <w:pStyle w:val="Heading3"/>
       </w:pPr>
       <w:r>
-        <w:t xml:space="preserve">Tarefa 1 — Cadastrar uma colega e a chave dela</w:t>
+        <w:t xml:space="preserve">Tarefa 0 — Primeira impressão (aquecimento)</w:t>
       </w:r>
     </w:p>
     <w:p>
@@ -627,126 +1104,105 @@
         <w:pStyle w:val="FirstParagraph"/>
       </w:pPr>
       <w:r>
-        <w:t xml:space="preserve">Sua colega</w:t>
-      </w:r>
-      <w:r>
-        <w:t xml:space="preserve"> </w:t>
-      </w:r>
-      <w:r>
-        <w:rPr>
-          <w:bCs/>
-          <w:b/>
-        </w:rPr>
-        <w:t xml:space="preserve">Alice</w:t>
-      </w:r>
-      <w:r>
-        <w:t xml:space="preserve"> </w:t>
-      </w:r>
-      <w:r>
-        <w:t xml:space="preserve">vai precisar de acesso. Dados: nome</w:t>
-      </w:r>
-      <w:r>
-        <w:t xml:space="preserve"> </w:t>
-      </w:r>
-      <w:r>
+        <w:t xml:space="preserve">Rode</w:t>
+      </w:r>
+      <w:r>
+        <w:t xml:space="preserve"> </w:t>
+      </w:r>
+      <w:r>
+        <w:rPr>
+          <w:rStyle w:val="VerbatimChar"/>
+        </w:rPr>
+        <w:t xml:space="preserve">adminforge --help</w:t>
+      </w:r>
+      <w:r>
+        <w:t xml:space="preserve">. Em voz alta: na sua leitura,</w:t>
+      </w:r>
+      <w:r>
+        <w:t xml:space="preserve"> </w:t>
+      </w:r>
+      <w:r>
+        <w:rPr>
+          <w:bCs/>
+          <w:b/>
+        </w:rPr>
+        <w:t xml:space="preserve">o que essa ferramenta faz?</w:t>
+      </w:r>
+      <w:r>
+        <w:t xml:space="preserve"> </w:t>
+      </w:r>
+      <w:r>
+        <w:t xml:space="preserve">Se tivesse que</w:t>
+      </w:r>
+      <w:r>
+        <w:t xml:space="preserve"> </w:t>
+      </w:r>
+      <w:r>
+        <w:t xml:space="preserve">começar do zero,</w:t>
+      </w:r>
+      <w:r>
+        <w:t xml:space="preserve"> </w:t>
+      </w:r>
+      <w:r>
+        <w:rPr>
+          <w:bCs/>
+          <w:b/>
+        </w:rPr>
+        <w:t xml:space="preserve">por onde começaria?</w:t>
+      </w:r>
+    </w:p>
+    <w:p>
+      <w:pPr>
+        <w:pStyle w:val="BodyText"/>
+      </w:pPr>
+      <w:r>
+        <w:rPr>
+          <w:iCs/>
+          <w:i/>
+        </w:rPr>
+        <w:t xml:space="preserve">(Não precisa</w:t>
+      </w:r>
+      <w:r>
+        <w:rPr>
+          <w:iCs/>
+          <w:i/>
+        </w:rPr>
+        <w:t xml:space="preserve"> </w:t>
+      </w:r>
+      <w:r>
+        <w:rPr>
+          <w:iCs/>
+          <w:i/>
+        </w:rPr>
         <w:t xml:space="preserve">“</w:t>
       </w:r>
       <w:r>
-        <w:t xml:space="preserve">Alice Souza</w:t>
-      </w:r>
-      <w:r>
+        <w:rPr>
+          <w:iCs/>
+          <w:i/>
+        </w:rPr>
+        <w:t xml:space="preserve">concluir</w:t>
+      </w:r>
+      <w:r>
+        <w:rPr>
+          <w:iCs/>
+          <w:i/>
+        </w:rPr>
         <w:t xml:space="preserve">”</w:t>
       </w:r>
       <w:r>
-        <w:t xml:space="preserve">, e-mail</w:t>
-      </w:r>
-      <w:r>
-        <w:t xml:space="preserve"> </w:t>
-      </w:r>
-      <w:r>
-        <w:rPr>
-          <w:rStyle w:val="VerbatimChar"/>
-        </w:rPr>
-        <w:t xml:space="preserve">alice@empresa.com</w:t>
-      </w:r>
-      <w:r>
-        <w:t xml:space="preserve">,</w:t>
-      </w:r>
-      <w:r>
-        <w:t xml:space="preserve"> </w:t>
-      </w:r>
-      <w:r>
-        <w:t xml:space="preserve">login Unix</w:t>
-      </w:r>
-      <w:r>
-        <w:t xml:space="preserve"> </w:t>
-      </w:r>
-      <w:r>
-        <w:rPr>
-          <w:rStyle w:val="VerbatimChar"/>
-        </w:rPr>
-        <w:t xml:space="preserve">alice</w:t>
-      </w:r>
-      <w:r>
-        <w:t xml:space="preserve">. A chave pública SSH dela está no arquivo</w:t>
-      </w:r>
-      <w:r>
-        <w:t xml:space="preserve"> </w:t>
-      </w:r>
-      <w:r>
-        <w:rPr>
-          <w:rStyle w:val="VerbatimChar"/>
-          <w:bCs/>
-          <w:b/>
-        </w:rPr>
-        <w:t xml:space="preserve">alice.pub</w:t>
-      </w:r>
-      <w:r>
-        <w:t xml:space="preserve"> </w:t>
-      </w:r>
-      <w:r>
-        <w:t xml:space="preserve">(no diretório em que você está;</w:t>
-      </w:r>
-      <w:r>
-        <w:t xml:space="preserve"> </w:t>
-      </w:r>
-      <w:r>
-        <w:rPr>
-          <w:rStyle w:val="VerbatimChar"/>
-        </w:rPr>
-        <w:t xml:space="preserve">ls</w:t>
-      </w:r>
-      <w:r>
-        <w:t xml:space="preserve"> </w:t>
-      </w:r>
-      <w:r>
-        <w:t xml:space="preserve">mostra).</w:t>
-      </w:r>
-    </w:p>
-    <w:p>
-      <w:pPr>
-        <w:pStyle w:val="BodyText"/>
-      </w:pPr>
-      <w:r>
-        <w:rPr>
-          <w:bCs/>
-          <w:b/>
-        </w:rPr>
-        <w:t xml:space="preserve">Objetivo:</w:t>
-      </w:r>
-      <w:r>
-        <w:t xml:space="preserve"> </w:t>
-      </w:r>
-      <w:r>
-        <w:t xml:space="preserve">a Alice cadastrada no AdminForge, com a chave pública dela registrada.</w:t>
-      </w:r>
-    </w:p>
-    <w:p>
-      <w:pPr>
-        <w:pStyle w:val="BlockText"/>
-      </w:pPr>
-      <w:r>
-        <w:t xml:space="preserve">Avise quando achar que terminou.</w:t>
+        <w:rPr>
+          <w:iCs/>
+          <w:i/>
+        </w:rPr>
+        <w:t xml:space="preserve"> </w:t>
+      </w:r>
+      <w:r>
+        <w:rPr>
+          <w:iCs/>
+          <w:i/>
+        </w:rPr>
+        <w:t xml:space="preserve">nada aqui — é só pra calibrar e ouvir sua primeira impressão.)</w:t>
       </w:r>
     </w:p>
     <w:p>
@@ -756,8 +1212,152 @@
         </w:pict>
       </w:r>
     </w:p>
-    <w:bookmarkEnd w:id="22"/>
-    <w:bookmarkStart w:id="23" w:name="tarefa-2-colocar-a-frota-no-adminforge"/>
+    <w:bookmarkEnd w:id="24"/>
+    <w:bookmarkStart w:id="25" w:name="Xd31e8334c4ba1e898b6c64749136017d9c9839a"/>
+    <w:p>
+      <w:pPr>
+        <w:pStyle w:val="Heading3"/>
+      </w:pPr>
+      <w:r>
+        <w:t xml:space="preserve">Tarefa 1 — Cadastrar uma colega e a chave dela</w:t>
+      </w:r>
+    </w:p>
+    <w:p>
+      <w:pPr>
+        <w:pStyle w:val="FirstParagraph"/>
+      </w:pPr>
+      <w:r>
+        <w:t xml:space="preserve">Sua colega</w:t>
+      </w:r>
+      <w:r>
+        <w:t xml:space="preserve"> </w:t>
+      </w:r>
+      <w:r>
+        <w:rPr>
+          <w:bCs/>
+          <w:b/>
+        </w:rPr>
+        <w:t xml:space="preserve">Alice</w:t>
+      </w:r>
+      <w:r>
+        <w:t xml:space="preserve"> </w:t>
+      </w:r>
+      <w:r>
+        <w:t xml:space="preserve">vai precisar de acesso. Dados: nome</w:t>
+      </w:r>
+      <w:r>
+        <w:t xml:space="preserve"> </w:t>
+      </w:r>
+      <w:r>
+        <w:t xml:space="preserve">“</w:t>
+      </w:r>
+      <w:r>
+        <w:t xml:space="preserve">Alice Souza</w:t>
+      </w:r>
+      <w:r>
+        <w:t xml:space="preserve">”</w:t>
+      </w:r>
+      <w:r>
+        <w:t xml:space="preserve">, e-mail</w:t>
+      </w:r>
+      <w:r>
+        <w:t xml:space="preserve"> </w:t>
+      </w:r>
+      <w:r>
+        <w:rPr>
+          <w:rStyle w:val="VerbatimChar"/>
+        </w:rPr>
+        <w:t xml:space="preserve">alice@empresa.com</w:t>
+      </w:r>
+      <w:r>
+        <w:t xml:space="preserve">,</w:t>
+      </w:r>
+      <w:r>
+        <w:t xml:space="preserve"> </w:t>
+      </w:r>
+      <w:r>
+        <w:t xml:space="preserve">login Unix</w:t>
+      </w:r>
+      <w:r>
+        <w:t xml:space="preserve"> </w:t>
+      </w:r>
+      <w:r>
+        <w:rPr>
+          <w:rStyle w:val="VerbatimChar"/>
+        </w:rPr>
+        <w:t xml:space="preserve">alice</w:t>
+      </w:r>
+      <w:r>
+        <w:t xml:space="preserve">. A chave pública SSH dela está no arquivo</w:t>
+      </w:r>
+      <w:r>
+        <w:t xml:space="preserve"> </w:t>
+      </w:r>
+      <w:r>
+        <w:rPr>
+          <w:rStyle w:val="VerbatimChar"/>
+          <w:bCs/>
+          <w:b/>
+        </w:rPr>
+        <w:t xml:space="preserve">alice.pub</w:t>
+      </w:r>
+      <w:r>
+        <w:t xml:space="preserve"> </w:t>
+      </w:r>
+      <w:r>
+        <w:t xml:space="preserve">(no diretório em que você está;</w:t>
+      </w:r>
+      <w:r>
+        <w:t xml:space="preserve"> </w:t>
+      </w:r>
+      <w:r>
+        <w:rPr>
+          <w:rStyle w:val="VerbatimChar"/>
+        </w:rPr>
+        <w:t xml:space="preserve">ls</w:t>
+      </w:r>
+      <w:r>
+        <w:t xml:space="preserve"> </w:t>
+      </w:r>
+      <w:r>
+        <w:t xml:space="preserve">mostra).</w:t>
+      </w:r>
+    </w:p>
+    <w:p>
+      <w:pPr>
+        <w:pStyle w:val="BodyText"/>
+      </w:pPr>
+      <w:r>
+        <w:rPr>
+          <w:bCs/>
+          <w:b/>
+        </w:rPr>
+        <w:t xml:space="preserve">Objetivo:</w:t>
+      </w:r>
+      <w:r>
+        <w:t xml:space="preserve"> </w:t>
+      </w:r>
+      <w:r>
+        <w:t xml:space="preserve">a Alice cadastrada no AdminForge, com a chave pública dela registrada.</w:t>
+      </w:r>
+    </w:p>
+    <w:p>
+      <w:pPr>
+        <w:pStyle w:val="BlockText"/>
+      </w:pPr>
+      <w:r>
+        <w:t xml:space="preserve">Avise quando achar que terminou.</w:t>
+      </w:r>
+    </w:p>
+    <w:p>
+      <w:r>
+        <w:pict>
+          <v:rect style="width:0;height:1.5pt" o:hralign="center" o:hrstd="t" o:hr="t"/>
+        </w:pict>
+      </w:r>
+    </w:p>
+    <w:bookmarkEnd w:id="25"/>
+    <w:bookmarkStart w:id="26" w:name="tarefa-2-colocar-a-frota-no-adminforge"/>
     <w:p>
       <w:pPr>
         <w:pStyle w:val="Heading3"/>
@@ -994,8 +1594,8 @@
         </w:pict>
       </w:r>
     </w:p>
-    <w:bookmarkEnd w:id="23"/>
-    <w:bookmarkStart w:id="24" w:name="tarefa-3-organizar-em-grupos"/>
+    <w:bookmarkEnd w:id="26"/>
+    <w:bookmarkStart w:id="27" w:name="tarefa-3-organizar-em-grupos"/>
     <w:p>
       <w:pPr>
         <w:pStyle w:val="Heading3"/>
@@ -1016,7 +1616,7 @@
       <w:pPr>
         <w:numPr>
           <w:ilvl w:val="0"/>
-          <w:numId w:val="1002"/>
+          <w:numId w:val="1005"/>
         </w:numPr>
         <w:pStyle w:val="Compact"/>
       </w:pPr>
@@ -1058,7 +1658,7 @@
       <w:pPr>
         <w:numPr>
           <w:ilvl w:val="0"/>
-          <w:numId w:val="1002"/>
+          <w:numId w:val="1005"/>
         </w:numPr>
         <w:pStyle w:val="Compact"/>
       </w:pPr>
@@ -1127,7 +1727,7 @@
       <w:pPr>
         <w:numPr>
           <w:ilvl w:val="0"/>
-          <w:numId w:val="1002"/>
+          <w:numId w:val="1005"/>
         </w:numPr>
         <w:pStyle w:val="Compact"/>
       </w:pPr>
@@ -1202,8 +1802,8 @@
         </w:pict>
       </w:r>
     </w:p>
-    <w:bookmarkEnd w:id="24"/>
-    <w:bookmarkStart w:id="25" w:name="tarefa-4-conceder-os-acessos"/>
+    <w:bookmarkEnd w:id="27"/>
+    <w:bookmarkStart w:id="28" w:name="tarefa-4-conceder-os-acessos"/>
     <w:p>
       <w:pPr>
         <w:pStyle w:val="Heading3"/>
@@ -1224,7 +1824,7 @@
       <w:pPr>
         <w:numPr>
           <w:ilvl w:val="0"/>
-          <w:numId w:val="1003"/>
+          <w:numId w:val="1006"/>
         </w:numPr>
         <w:pStyle w:val="Compact"/>
       </w:pPr>
@@ -1295,7 +1895,7 @@
       <w:pPr>
         <w:numPr>
           <w:ilvl w:val="0"/>
-          <w:numId w:val="1003"/>
+          <w:numId w:val="1006"/>
         </w:numPr>
         <w:pStyle w:val="Compact"/>
       </w:pPr>
@@ -1376,8 +1976,8 @@
         </w:pict>
       </w:r>
     </w:p>
-    <w:bookmarkEnd w:id="25"/>
-    <w:bookmarkStart w:id="26" w:name="tarefa-5-fazer-valer-e-conferir"/>
+    <w:bookmarkEnd w:id="28"/>
+    <w:bookmarkStart w:id="29" w:name="tarefa-5-fazer-valer-e-conferir"/>
     <w:p>
       <w:pPr>
         <w:pStyle w:val="Heading3"/>
@@ -1457,8 +2057,8 @@
         </w:pict>
       </w:r>
     </w:p>
-    <w:bookmarkEnd w:id="26"/>
-    <w:bookmarkStart w:id="27" w:name="tarefa-6-restringir-o-sudo-no-banco"/>
+    <w:bookmarkEnd w:id="29"/>
+    <w:bookmarkStart w:id="30" w:name="tarefa-6-restringir-o-sudo-no-banco"/>
     <w:p>
       <w:pPr>
         <w:pStyle w:val="Heading3"/>
@@ -1564,7 +2164,7 @@
       <w:pPr>
         <w:numPr>
           <w:ilvl w:val="0"/>
-          <w:numId w:val="1004"/>
+          <w:numId w:val="1007"/>
         </w:numPr>
         <w:pStyle w:val="Compact"/>
       </w:pPr>
@@ -1579,7 +2179,7 @@
       <w:pPr>
         <w:numPr>
           <w:ilvl w:val="0"/>
-          <w:numId w:val="1004"/>
+          <w:numId w:val="1007"/>
         </w:numPr>
         <w:pStyle w:val="Compact"/>
       </w:pPr>
@@ -1664,8 +2264,8 @@
         </w:pict>
       </w:r>
     </w:p>
-    <w:bookmarkEnd w:id="27"/>
-    <w:bookmarkStart w:id="28" w:name="tarefa-7-alguém-saiu-da-empresa"/>
+    <w:bookmarkEnd w:id="30"/>
+    <w:bookmarkStart w:id="31" w:name="tarefa-7-alguém-saiu-da-empresa"/>
     <w:p>
       <w:pPr>
         <w:pStyle w:val="Heading3"/>
@@ -1739,8 +2339,8 @@
         </w:pict>
       </w:r>
     </w:p>
-    <w:bookmarkEnd w:id="28"/>
-    <w:bookmarkStart w:id="29" w:name="X617cb433eca30a8ec99eac66f4e8c658bd416f1"/>
+    <w:bookmarkEnd w:id="31"/>
+    <w:bookmarkStart w:id="32" w:name="X617cb433eca30a8ec99eac66f4e8c658bd416f1"/>
     <w:p>
       <w:pPr>
         <w:pStyle w:val="Heading3"/>
@@ -1862,8 +2462,8 @@
         </w:pict>
       </w:r>
     </w:p>
-    <w:bookmarkEnd w:id="29"/>
-    <w:bookmarkStart w:id="30" w:name="X09526aadef02164d77f7a3fc2f4ff7956da6739"/>
+    <w:bookmarkEnd w:id="32"/>
+    <w:bookmarkStart w:id="33" w:name="X09526aadef02164d77f7a3fc2f4ff7956da6739"/>
     <w:p>
       <w:pPr>
         <w:pStyle w:val="Heading3"/>
@@ -1944,9 +2544,9 @@
         <w:t xml:space="preserve">Fim das tarefas. O facilitador vai te passar um questionário curto e fazer algumas perguntas.</w:t>
       </w:r>
     </w:p>
-    <w:bookmarkEnd w:id="30"/>
-    <w:bookmarkEnd w:id="31"/>
-    <w:bookmarkEnd w:id="32"/>
+    <w:bookmarkEnd w:id="33"/>
+    <w:bookmarkEnd w:id="34"/>
+    <w:bookmarkEnd w:id="35"/>
     <w:sectPr/>
   </w:body>
 </w:document>
@@ -2142,6 +2742,15 @@
     <w:abstractNumId w:val="991"/>
   </w:num>
   <w:num w:numId="1004">
+    <w:abstractNumId w:val="991"/>
+  </w:num>
+  <w:num w:numId="1005">
+    <w:abstractNumId w:val="991"/>
+  </w:num>
+  <w:num w:numId="1006">
+    <w:abstractNumId w:val="991"/>
+  </w:num>
+  <w:num w:numId="1007">
     <w:abstractNumId w:val="991"/>
   </w:num>
 </w:numbering>

</xml_diff>

<commit_message>
docs(roteiro): participante usa 'af' como comando; indice de referencias
- ROTEIRO_PARTICIPANTE: o comando que o participante digita passa a ser 'af'
  (adminforge segue como nome longo); nome do produto AdminForge inalterado.
- docs/usability-study/referencias/: README indexando os artigos do Metodo 1
  (marcador -> arquivo -> referencia). Os PDFs em si ficam fora do git
  (.gitignore: *.pdf) — baixaveis pelos links do README.
</commit_message>
<xml_diff>
--- a/docs/usability-study/ROTEIRO_PARTICIPANTE.docx
+++ b/docs/usability-study/ROTEIRO_PARTICIPANTE.docx
@@ -778,42 +778,40 @@
           <w:bCs/>
           <w:b/>
         </w:rPr>
+        <w:t xml:space="preserve">af</w:t>
+      </w:r>
+      <w:r>
+        <w:t xml:space="preserve"> </w:t>
+      </w:r>
+      <w:r>
+        <w:t xml:space="preserve">já está no</w:t>
+      </w:r>
+      <w:r>
+        <w:t xml:space="preserve"> </w:t>
+      </w:r>
+      <w:r>
+        <w:rPr>
+          <w:rStyle w:val="VerbatimChar"/>
+        </w:rPr>
+        <w:t xml:space="preserve">PATH</w:t>
+      </w:r>
+      <w:r>
+        <w:t xml:space="preserve"> </w:t>
+      </w:r>
+      <w:r>
+        <w:t xml:space="preserve">(</w:t>
+      </w:r>
+      <w:r>
+        <w:rPr>
+          <w:rStyle w:val="VerbatimChar"/>
+        </w:rPr>
         <w:t xml:space="preserve">adminforge</w:t>
       </w:r>
       <w:r>
         <w:t xml:space="preserve"> </w:t>
       </w:r>
       <w:r>
-        <w:t xml:space="preserve">já está no</w:t>
-      </w:r>
-      <w:r>
-        <w:t xml:space="preserve"> </w:t>
-      </w:r>
-      <w:r>
-        <w:rPr>
-          <w:rStyle w:val="VerbatimChar"/>
-        </w:rPr>
-        <w:t xml:space="preserve">PATH</w:t>
-      </w:r>
-      <w:r>
-        <w:t xml:space="preserve"> </w:t>
-      </w:r>
-      <w:r>
-        <w:t xml:space="preserve">(atalho:</w:t>
-      </w:r>
-      <w:r>
-        <w:t xml:space="preserve"> </w:t>
-      </w:r>
-      <w:r>
-        <w:rPr>
-          <w:rStyle w:val="VerbatimChar"/>
-          <w:bCs/>
-          <w:b/>
-        </w:rPr>
-        <w:t xml:space="preserve">af</w:t>
-      </w:r>
-      <w:r>
-        <w:t xml:space="preserve">);</w:t>
+        <w:t xml:space="preserve">é o nome longo do mesmo comando);</w:t>
       </w:r>
     </w:p>
     <w:p>
@@ -1113,7 +1111,7 @@
         <w:rPr>
           <w:rStyle w:val="VerbatimChar"/>
         </w:rPr>
-        <w:t xml:space="preserve">adminforge --help</w:t>
+        <w:t xml:space="preserve">af --help</w:t>
       </w:r>
       <w:r>
         <w:t xml:space="preserve">. Em voz alta: na sua leitura,</w:t>

</xml_diff>

<commit_message>
docs(roteiro): comando 'af', Tarefa 6 e piada do fim (sem vies)
</commit_message>
<xml_diff>
--- a/docs/usability-study/ROTEIRO_PARTICIPANTE.docx
+++ b/docs/usability-study/ROTEIRO_PARTICIPANTE.docx
@@ -2627,28 +2627,7 @@
         <w:t xml:space="preserve"> </w:t>
       </w:r>
       <w:r>
-        <w:t xml:space="preserve">num comando só — limpo, auditado, com hash.</w:t>
-      </w:r>
-      <w:r>
-        <w:t xml:space="preserve"> </w:t>
-      </w:r>
-      <w:r>
-        <w:t xml:space="preserve">E aí o</w:t>
-      </w:r>
-      <w:r>
-        <w:t xml:space="preserve"> </w:t>
-      </w:r>
-      <w:r>
-        <w:rPr>
-          <w:rStyle w:val="VerbatimChar"/>
-        </w:rPr>
-        <w:t xml:space="preserve">audit</w:t>
-      </w:r>
-      <w:r>
-        <w:t xml:space="preserve"> </w:t>
-      </w:r>
-      <w:r>
-        <w:t xml:space="preserve">do</w:t>
+        <w:t xml:space="preserve">hoje. E aí, no</w:t>
       </w:r>
       <w:r>
         <w:t xml:space="preserve"> </w:t>
@@ -2660,16 +2639,13 @@
         <w:t xml:space="preserve">web-02</w:t>
       </w:r>
       <w:r>
-        <w:t xml:space="preserve"> </w:t>
-      </w:r>
-      <w:r>
-        <w:t xml:space="preserve">revelou uma regra de sudo que ela mesma tinha posto na mão,</w:t>
-      </w:r>
-      <w:r>
-        <w:t xml:space="preserve"> </w:t>
-      </w:r>
-      <w:r>
-        <w:t xml:space="preserve">se dando root por fora do AdminForge. Ahhh…</w:t>
+        <w:t xml:space="preserve">, achou uma regra de</w:t>
+      </w:r>
+      <w:r>
+        <w:t xml:space="preserve"> </w:t>
+      </w:r>
+      <w:r>
+        <w:t xml:space="preserve">sudo que ela mesma tinha posto na mão, fora do AdminForge, se dando root. Ahhh…</w:t>
       </w:r>
       <w:r>
         <w:t xml:space="preserve"> </w:t>
@@ -2679,55 +2655,27 @@
           <w:iCs/>
           <w:i/>
         </w:rPr>
-        <w:t xml:space="preserve">era por isso</w:t>
+        <w:t xml:space="preserve">era por</w:t>
+      </w:r>
+      <w:r>
+        <w:rPr>
+          <w:iCs/>
+          <w:i/>
+        </w:rPr>
+        <w:t xml:space="preserve"> </w:t>
+      </w:r>
+      <w:r>
+        <w:rPr>
+          <w:iCs/>
+          <w:i/>
+        </w:rPr>
+        <w:t xml:space="preserve">isso</w:t>
       </w:r>
       <w:r>
         <w:t xml:space="preserve"> </w:t>
       </w:r>
       <w:r>
         <w:t xml:space="preserve">que a Alice foi demitida.</w:t>
-      </w:r>
-      <w:r>
-        <w:t xml:space="preserve"> </w:t>
-      </w:r>
-      <w:r>
-        <w:t xml:space="preserve">(E é por isso que</w:t>
-      </w:r>
-      <w:r>
-        <w:t xml:space="preserve"> </w:t>
-      </w:r>
-      <w:r>
-        <w:rPr>
-          <w:rStyle w:val="VerbatimChar"/>
-        </w:rPr>
-        <w:t xml:space="preserve">apply</w:t>
-      </w:r>
-      <w:r>
-        <w:t xml:space="preserve"> </w:t>
-      </w:r>
-      <w:r>
-        <w:t xml:space="preserve">sozinho não basta: ele desfaz o que ele fez — o que a Alice</w:t>
-      </w:r>
-      <w:r>
-        <w:t xml:space="preserve"> </w:t>
-      </w:r>
-      <w:r>
-        <w:t xml:space="preserve">aprontou por fora, só o</w:t>
-      </w:r>
-      <w:r>
-        <w:t xml:space="preserve"> </w:t>
-      </w:r>
-      <w:r>
-        <w:rPr>
-          <w:rStyle w:val="VerbatimChar"/>
-        </w:rPr>
-        <w:t xml:space="preserve">audit</w:t>
-      </w:r>
-      <w:r>
-        <w:t xml:space="preserve"> </w:t>
-      </w:r>
-      <w:r>
-        <w:t xml:space="preserve">enxerga.)</w:t>
       </w:r>
     </w:p>
     <w:p>

</xml_diff>